<commit_message>
Afegeix imatges al temari i a les diapositives de RA2 (AA1/AA2/AA3)
Segueix el mateix patro aplicat a RA1: incorpora imatges tant al
document de teoria (.md i .docx) com a la presentacio (.pptx) de cada
subtema, sense modificar el contingut textual ja existent.

AA1 (Protegint les dades): captura de titulars reals sobre ransomware.

AA2 (Sistemes d'emmagatzematge): diagrames de tots els nivells de RAID
(0, 1, 5, 6, 10) i la comparativa animada, mes fotografies/esquemes
reals de DAS, NAS i SAN.

AA3 (Copies de seguretat): esquema de la regla 3-2-1, comparativa
copia incremental/diferencial, esquemes GFS i Torres de Hanoi, i una
fotografia d'una clonadora forense.

Totes les imatges provenen del repositori font SMX-0226SI/Materials
(llicencia CC-BY-SA-4.0), ja utilitzat com a base de contingut d'aquestes
unitats.
Co-Authored-By: Claude Sonnet 5 <noreply@anthropic.com>
Claude-Session: https://claude.ai/code/session_01N3G5yf1RZohTyRwwRiXySq
</commit_message>
<xml_diff>
--- a/RA2 - Emmagatzematge i copies de seguretat/AA1 - Protegint les dades/T01_Temari_Protegint_les_dades.docx
+++ b/RA2 - Emmagatzematge i copies de seguretat/AA1 - Protegint les dades/T01_Temari_Protegint_les_dades.docx
@@ -83,6 +83,58 @@
           <w:szCs w:val="22"/>
         </w:rPr>
         <w:t xml:space="preserve">La informació és un dels actius més valuosos de qualsevol empresa. Si un disc dur s'avaria, els programes es poden tornar a instal·lar sense gaire dificultat, però les dades, si es perden, normalment no es poden recuperar de cap manera. Per aquest motiu, les dades també són un dels objectius més cercats pels delinqüents: el segrest de dades (ransomware), un programari maliciós que xifra la informació d'una víctima i en demana un rescat econòmic per desxifrar-la, s'ha convertit en una de les principals amenaces per a les empreses d'avui dia.</w:t>
+      </w:r>
+    </w:p>
+    <w:p>
+      <w:pPr>
+        <w:jc w:val="center"/>
+      </w:pPr>
+      <w:r>
+        <w:drawing>
+          <wp:inline xmlns:a="http://schemas.openxmlformats.org/drawingml/2006/main" xmlns:pic="http://schemas.openxmlformats.org/drawingml/2006/picture">
+            <wp:extent cx="3200400" cy="4790620"/>
+            <wp:docPr id="1" name="Picture 1"/>
+            <wp:cNvGraphicFramePr>
+              <a:graphicFrameLocks noChangeAspect="1"/>
+            </wp:cNvGraphicFramePr>
+            <a:graphic>
+              <a:graphicData uri="http://schemas.openxmlformats.org/drawingml/2006/picture">
+                <pic:pic>
+                  <pic:nvPicPr>
+                    <pic:cNvPr id="0" name="ransomware.png"/>
+                    <pic:cNvPicPr/>
+                  </pic:nvPicPr>
+                  <pic:blipFill>
+                    <a:blip r:embed="rId8"/>
+                    <a:stretch>
+                      <a:fillRect/>
+                    </a:stretch>
+                  </pic:blipFill>
+                  <pic:spPr>
+                    <a:xfrm>
+                      <a:off x="0" y="0"/>
+                      <a:ext cx="3200400" cy="4790620"/>
+                    </a:xfrm>
+                    <a:prstGeom prst="rect"/>
+                  </pic:spPr>
+                </pic:pic>
+              </a:graphicData>
+            </a:graphic>
+          </wp:inline>
+        </w:drawing>
+      </w:r>
+    </w:p>
+    <w:p>
+      <w:pPr>
+        <w:jc w:val="center"/>
+      </w:pPr>
+      <w:r>
+        <w:rPr>
+          <w:i/>
+          <w:color w:val="5B6B77"/>
+          <w:sz w:val="19"/>
+        </w:rPr>
+        <w:t>El ransomware xifra les dades de la víctima i en demana un rescat econòmic per desxifrar-les.</w:t>
       </w:r>
     </w:p>
     <w:p>

</xml_diff>